<commit_message>
Fix: Oficina Privada también decía "Oficina 1" fijo en declaraciones
Además del "Oficina 0" que ya se corrigió en la cláusula de pago,
la sección de declaraciones traía otro "Oficina 1" fijo (con
comillas tipográficas partidas en runs distintos entre la versión
física y moral) que no se había detectado en la primera pasada.
Ahora también usa {{NUMERO_ESPACIO}}.

Co-Authored-By: Claude Sonnet 5 <noreply@anthropic.com>
</commit_message>
<xml_diff>
--- a/public/plantillas-contrato/BosquesOficinaPrivadaFisica.docx
+++ b/public/plantillas-contrato/BosquesOficinaPrivadaFisica.docx
@@ -419,10 +419,9 @@
           <w:bCs w:val="1"/>
           <w:sz w:val="22"/>
           <w:szCs w:val="22"/>
-          <w:highlight w:val="yellow"/>
-          <w:rtl w:val="0"/>
-        </w:rPr>
-        <w:t xml:space="preserve">“Oficina 1”</w:t>
+          <w:rtl w:val="0"/>
+        </w:rPr>
+        <w:t xml:space="preserve">“Oficina {{NUMERO_ESPACIO}}”</w:t>
       </w:r>
       <w:r>
         <w:rPr>

</xml_diff>